<commit_message>
Clarify prerequisites in sections 1.26-1.28
</commit_message>
<xml_diff>
--- a/revisions/2026-10-15/ch01/C언어_종합교과서_이해중심_정식개정판_제1장_1.26-1.28.docx
+++ b/revisions/2026-10-15/ch01/C언어_종합교과서_이해중심_정식개정판_제1장_1.26-1.28.docx
@@ -1372,6 +1372,17 @@
       </w:r>
     </w:p>
     <w:p>
+      <w:r>
+        <w:rPr>
+          <w:b/>
+        </w:rPr>
+        <w:t xml:space="preserve">조건 연산자 `?:`  |  </w:t>
+      </w:r>
+      <w:r>
+        <w:t>`조건 ? 참일 때 값 : 거짓일 때 값`은 두 값 중 하나를 선택하는 표현식이다. 27c에서 앞부분 최댓값과 새 요소를 비교할 때 사용한다.</w:t>
+      </w:r>
+    </w:p>
+    <w:p>
       <w:pPr>
         <w:pStyle w:val="Heading3"/>
       </w:pPr>
@@ -2588,6 +2599,39 @@
       </w:r>
       <w:r>
         <w:t>함수가 안전하게 처리할 수 있는 입력의 범위와 전제를 명시한 약속이다.</w:t>
+      </w:r>
+    </w:p>
+    <w:p>
+      <w:r>
+        <w:rPr>
+          <w:b/>
+        </w:rPr>
+        <w:t xml:space="preserve">주소 전달 `&amp;`  |  </w:t>
+      </w:r>
+      <w:r>
+        <w:t>`&amp;calls`는 main의 지역 정수 calls가 있는 위치를 나타내는 주소값을 구한다. 함수가 이 주소를 받으면 호출자의 값을 바꿀 수 있다.</w:t>
+      </w:r>
+    </w:p>
+    <w:p>
+      <w:r>
+        <w:rPr>
+          <w:b/>
+        </w:rPr>
+        <w:t xml:space="preserve">포인터 매개변수 `int *p`  |  </w:t>
+      </w:r>
+      <w:r>
+        <w:t>정수 객체의 주소를 저장할 수 있는 매개변수다. `*p`는 그 주소가 가리키는 정수 객체를 사용한다. 28b의 호출 횟수 계측에만 먼저 활용하고, 정확한 전체 규칙은 포인터 장에서 배운다.</w:t>
+      </w:r>
+    </w:p>
+    <w:p>
+      <w:r>
+        <w:rPr>
+          <w:b/>
+        </w:rPr>
+        <w:t xml:space="preserve">증가식 `++(*p)`  |  </w:t>
+      </w:r>
+      <w:r>
+        <w:t>포인터가 가리키는 정수 값을 1 증가시킨다. 괄호를 쓰면 `++*p`보다 읽기 쉽다. p가 유효한 주소라는 전제가 필요하다.</w:t>
       </w:r>
     </w:p>
     <w:p>

</xml_diff>